<commit_message>
Fix Home internet hours not syncing when streaming hours change
When Netflix or YouTube hours are updated, Home internet (WiFi) now automatically syncs to the same duration. Also syncs on URL state restore.

Co-Authored-By: Claude Sonnet 4.6 <noreply@anthropic.com>
</commit_message>
<xml_diff>
--- a/Change log.docx
+++ b/Change log.docx
@@ -87,8 +87,582 @@
         <w:pStyle w:val="PlainText"/>
         <w:rPr>
           <w:rFonts w:ascii="Courier New" w:hAnsi="Courier New" w:cs="Courier New"/>
-        </w:rPr>
-      </w:pPr>
+          <w:sz w:val="24"/>
+          <w:szCs w:val="24"/>
+        </w:rPr>
+      </w:pPr>
+    </w:p>
+    <w:p>
+      <w:pPr>
+        <w:pStyle w:val="PlainText"/>
+        <w:rPr>
+          <w:rFonts w:ascii="Courier New" w:hAnsi="Courier New" w:cs="Courier New"/>
+        </w:rPr>
+      </w:pPr>
+      <w:r>
+        <w:rPr>
+          <w:rFonts w:ascii="Courier New" w:hAnsi="Courier New" w:cs="Courier New"/>
+        </w:rPr>
+        <w:t>========================================</w:t>
+      </w:r>
+    </w:p>
+    <w:p>
+      <w:pPr>
+        <w:pStyle w:val="PlainText"/>
+        <w:rPr>
+          <w:rFonts w:ascii="Courier New" w:hAnsi="Courier New" w:cs="Courier New"/>
+          <w:b/>
+          <w:bCs/>
+        </w:rPr>
+      </w:pPr>
+      <w:r>
+        <w:rPr>
+          <w:rFonts w:ascii="Courier New" w:hAnsi="Courier New" w:cs="Courier New"/>
+          <w:b/>
+          <w:bCs/>
+        </w:rPr>
+        <w:t>0</w:t>
+      </w:r>
+      <w:r>
+        <w:rPr>
+          <w:rFonts w:ascii="Courier New" w:hAnsi="Courier New" w:cs="Courier New"/>
+          <w:b/>
+          <w:bCs/>
+        </w:rPr>
+        <w:t>5</w:t>
+      </w:r>
+      <w:r>
+        <w:rPr>
+          <w:rFonts w:ascii="Courier New" w:hAnsi="Courier New" w:cs="Courier New"/>
+          <w:b/>
+          <w:bCs/>
+        </w:rPr>
+        <w:t>/0</w:t>
+      </w:r>
+      <w:r>
+        <w:rPr>
+          <w:rFonts w:ascii="Courier New" w:hAnsi="Courier New" w:cs="Courier New"/>
+          <w:b/>
+          <w:bCs/>
+        </w:rPr>
+        <w:t>3</w:t>
+      </w:r>
+      <w:r>
+        <w:rPr>
+          <w:rFonts w:ascii="Courier New" w:hAnsi="Courier New" w:cs="Courier New"/>
+          <w:b/>
+          <w:bCs/>
+        </w:rPr>
+        <w:t>/20</w:t>
+      </w:r>
+      <w:r>
+        <w:rPr>
+          <w:rFonts w:ascii="Courier New" w:hAnsi="Courier New" w:cs="Courier New"/>
+          <w:b/>
+          <w:bCs/>
+        </w:rPr>
+        <w:t>2</w:t>
+      </w:r>
+      <w:r>
+        <w:rPr>
+          <w:rFonts w:ascii="Courier New" w:hAnsi="Courier New" w:cs="Courier New"/>
+          <w:b/>
+          <w:bCs/>
+        </w:rPr>
+        <w:t xml:space="preserve">6 </w:t>
+      </w:r>
+    </w:p>
+    <w:p>
+      <w:pPr>
+        <w:pStyle w:val="PlainText"/>
+        <w:rPr>
+          <w:rFonts w:ascii="Courier New" w:hAnsi="Courier New" w:cs="Courier New"/>
+        </w:rPr>
+      </w:pPr>
+      <w:r>
+        <w:rPr>
+          <w:rFonts w:ascii="Courier New" w:hAnsi="Courier New" w:cs="Courier New"/>
+        </w:rPr>
+        <w:t>========================================</w:t>
+      </w:r>
+    </w:p>
+    <w:p>
+      <w:pPr>
+        <w:pStyle w:val="PlainText"/>
+        <w:ind w:left="720"/>
+        <w:rPr>
+          <w:rFonts w:ascii="Courier New" w:hAnsi="Courier New" w:cs="Courier New"/>
+        </w:rPr>
+      </w:pPr>
+    </w:p>
+    <w:p>
+      <w:pPr>
+        <w:pStyle w:val="PlainText"/>
+        <w:numPr>
+          <w:ilvl w:val="0"/>
+          <w:numId w:val="15"/>
+        </w:numPr>
+        <w:rPr>
+          <w:rFonts w:ascii="Courier New" w:hAnsi="Courier New" w:cs="Courier New"/>
+        </w:rPr>
+      </w:pPr>
+      <w:r>
+        <w:rPr>
+          <w:rFonts w:ascii="Courier New" w:hAnsi="Courier New" w:cs="Courier New"/>
+        </w:rPr>
+        <w:t xml:space="preserve">Fixed a bug </w:t>
+      </w:r>
+      <w:r>
+        <w:rPr>
+          <w:rFonts w:ascii="Courier New" w:hAnsi="Courier New" w:cs="Courier New"/>
+        </w:rPr>
+        <w:t xml:space="preserve">where the hours of </w:t>
+      </w:r>
+      <w:proofErr w:type="gramStart"/>
+      <w:r>
+        <w:rPr>
+          <w:rFonts w:ascii="Courier New" w:hAnsi="Courier New" w:cs="Courier New"/>
+        </w:rPr>
+        <w:t>Home</w:t>
+      </w:r>
+      <w:proofErr w:type="gramEnd"/>
+      <w:r>
+        <w:rPr>
+          <w:rFonts w:ascii="Courier New" w:hAnsi="Courier New" w:cs="Courier New"/>
+        </w:rPr>
+        <w:t xml:space="preserve"> internet (</w:t>
+      </w:r>
+      <w:proofErr w:type="spellStart"/>
+      <w:r>
+        <w:rPr>
+          <w:rFonts w:ascii="Courier New" w:hAnsi="Courier New" w:cs="Courier New"/>
+        </w:rPr>
+        <w:t>WiFi</w:t>
+      </w:r>
+      <w:proofErr w:type="spellEnd"/>
+      <w:r>
+        <w:rPr>
+          <w:rFonts w:ascii="Courier New" w:hAnsi="Courier New" w:cs="Courier New"/>
+        </w:rPr>
+        <w:t>) did not automatically update according to how many hours of Streaming (Netflix or YouTube) were selected by the user.</w:t>
+      </w:r>
+      <w:r>
+        <w:rPr>
+          <w:rFonts w:ascii="Courier New" w:hAnsi="Courier New" w:cs="Courier New"/>
+        </w:rPr>
+        <w:br/>
+      </w:r>
+    </w:p>
+    <w:p>
+      <w:pPr>
+        <w:pStyle w:val="PlainText"/>
+        <w:rPr>
+          <w:rFonts w:ascii="Courier New" w:hAnsi="Courier New" w:cs="Courier New"/>
+        </w:rPr>
+      </w:pPr>
+    </w:p>
+    <w:p>
+      <w:pPr>
+        <w:pStyle w:val="PlainText"/>
+        <w:rPr>
+          <w:rFonts w:ascii="Courier New" w:hAnsi="Courier New" w:cs="Courier New"/>
+        </w:rPr>
+      </w:pPr>
+      <w:r>
+        <w:rPr>
+          <w:rFonts w:ascii="Courier New" w:hAnsi="Courier New" w:cs="Courier New"/>
+        </w:rPr>
+        <w:t>========================================</w:t>
+      </w:r>
+    </w:p>
+    <w:p>
+      <w:pPr>
+        <w:pStyle w:val="PlainText"/>
+        <w:rPr>
+          <w:rFonts w:ascii="Courier New" w:hAnsi="Courier New" w:cs="Courier New"/>
+          <w:b/>
+          <w:bCs/>
+        </w:rPr>
+      </w:pPr>
+      <w:r>
+        <w:rPr>
+          <w:rFonts w:ascii="Courier New" w:hAnsi="Courier New" w:cs="Courier New"/>
+          <w:b/>
+          <w:bCs/>
+        </w:rPr>
+        <w:t>03</w:t>
+      </w:r>
+      <w:r>
+        <w:rPr>
+          <w:rFonts w:ascii="Courier New" w:hAnsi="Courier New" w:cs="Courier New"/>
+          <w:b/>
+          <w:bCs/>
+        </w:rPr>
+        <w:t>/0</w:t>
+      </w:r>
+      <w:r>
+        <w:rPr>
+          <w:rFonts w:ascii="Courier New" w:hAnsi="Courier New" w:cs="Courier New"/>
+          <w:b/>
+          <w:bCs/>
+        </w:rPr>
+        <w:t>3</w:t>
+      </w:r>
+      <w:r>
+        <w:rPr>
+          <w:rFonts w:ascii="Courier New" w:hAnsi="Courier New" w:cs="Courier New"/>
+          <w:b/>
+          <w:bCs/>
+        </w:rPr>
+        <w:t>/20</w:t>
+      </w:r>
+      <w:r>
+        <w:rPr>
+          <w:rFonts w:ascii="Courier New" w:hAnsi="Courier New" w:cs="Courier New"/>
+          <w:b/>
+          <w:bCs/>
+        </w:rPr>
+        <w:t>2</w:t>
+      </w:r>
+      <w:r>
+        <w:rPr>
+          <w:rFonts w:ascii="Courier New" w:hAnsi="Courier New" w:cs="Courier New"/>
+          <w:b/>
+          <w:bCs/>
+        </w:rPr>
+        <w:t xml:space="preserve">6 </w:t>
+      </w:r>
+    </w:p>
+    <w:p>
+      <w:pPr>
+        <w:pStyle w:val="PlainText"/>
+        <w:rPr>
+          <w:rFonts w:ascii="Courier New" w:hAnsi="Courier New" w:cs="Courier New"/>
+        </w:rPr>
+      </w:pPr>
+      <w:r>
+        <w:rPr>
+          <w:rFonts w:ascii="Courier New" w:hAnsi="Courier New" w:cs="Courier New"/>
+        </w:rPr>
+        <w:t>========================================</w:t>
+      </w:r>
+    </w:p>
+    <w:p>
+      <w:pPr>
+        <w:pStyle w:val="PlainText"/>
+        <w:ind w:left="720"/>
+        <w:rPr>
+          <w:rFonts w:ascii="Courier New" w:hAnsi="Courier New" w:cs="Courier New"/>
+        </w:rPr>
+      </w:pPr>
+    </w:p>
+    <w:p>
+      <w:pPr>
+        <w:pStyle w:val="PlainText"/>
+        <w:numPr>
+          <w:ilvl w:val="0"/>
+          <w:numId w:val="15"/>
+        </w:numPr>
+        <w:rPr>
+          <w:rFonts w:ascii="Courier New" w:hAnsi="Courier New" w:cs="Courier New"/>
+        </w:rPr>
+      </w:pPr>
+      <w:r>
+        <w:rPr>
+          <w:rFonts w:ascii="Courier New" w:hAnsi="Courier New" w:cs="Courier New"/>
+        </w:rPr>
+        <w:t xml:space="preserve">Fixed a bug </w:t>
+      </w:r>
+      <w:r>
+        <w:rPr>
+          <w:rFonts w:ascii="Courier New" w:hAnsi="Courier New" w:cs="Courier New"/>
+        </w:rPr>
+        <w:t>that</w:t>
+      </w:r>
+      <w:r>
+        <w:rPr>
+          <w:rFonts w:ascii="Courier New" w:hAnsi="Courier New" w:cs="Courier New"/>
+        </w:rPr>
+        <w:t xml:space="preserve"> </w:t>
+      </w:r>
+      <w:r>
+        <w:rPr>
+          <w:rFonts w:ascii="Courier New" w:hAnsi="Courier New" w:cs="Courier New"/>
+        </w:rPr>
+        <w:t>showed</w:t>
+      </w:r>
+      <w:r>
+        <w:rPr>
+          <w:rFonts w:ascii="Courier New" w:hAnsi="Courier New" w:cs="Courier New"/>
+        </w:rPr>
+        <w:t xml:space="preserve"> incorrect cost calculations for gas products (e.g. gas oven</w:t>
+      </w:r>
+      <w:r>
+        <w:rPr>
+          <w:rFonts w:ascii="Courier New" w:hAnsi="Courier New" w:cs="Courier New"/>
+        </w:rPr>
+        <w:t xml:space="preserve"> and shower</w:t>
+      </w:r>
+      <w:r>
+        <w:rPr>
+          <w:rFonts w:ascii="Courier New" w:hAnsi="Courier New" w:cs="Courier New"/>
+        </w:rPr>
+        <w:t>) for some countr</w:t>
+      </w:r>
+      <w:r>
+        <w:rPr>
+          <w:rFonts w:ascii="Courier New" w:hAnsi="Courier New" w:cs="Courier New"/>
+        </w:rPr>
+        <w:t>y selections</w:t>
+      </w:r>
+      <w:r>
+        <w:rPr>
+          <w:rFonts w:ascii="Courier New" w:hAnsi="Courier New" w:cs="Courier New"/>
+        </w:rPr>
+        <w:t>.</w:t>
+      </w:r>
+    </w:p>
+    <w:p>
+      <w:pPr>
+        <w:pStyle w:val="PlainText"/>
+        <w:rPr>
+          <w:rFonts w:ascii="Courier New" w:hAnsi="Courier New" w:cs="Courier New"/>
+        </w:rPr>
+      </w:pPr>
+    </w:p>
+    <w:p>
+      <w:pPr>
+        <w:pStyle w:val="PlainText"/>
+        <w:rPr>
+          <w:rFonts w:ascii="Courier New" w:hAnsi="Courier New" w:cs="Courier New"/>
+        </w:rPr>
+      </w:pPr>
+    </w:p>
+    <w:p>
+      <w:pPr>
+        <w:pStyle w:val="PlainText"/>
+        <w:rPr>
+          <w:rFonts w:ascii="Courier New" w:hAnsi="Courier New" w:cs="Courier New"/>
+        </w:rPr>
+      </w:pPr>
+      <w:r>
+        <w:rPr>
+          <w:rFonts w:ascii="Courier New" w:hAnsi="Courier New" w:cs="Courier New"/>
+        </w:rPr>
+        <w:t>========================================</w:t>
+      </w:r>
+    </w:p>
+    <w:p>
+      <w:pPr>
+        <w:pStyle w:val="PlainText"/>
+        <w:rPr>
+          <w:rFonts w:ascii="Courier New" w:hAnsi="Courier New" w:cs="Courier New"/>
+          <w:b/>
+          <w:bCs/>
+        </w:rPr>
+      </w:pPr>
+      <w:r>
+        <w:rPr>
+          <w:rFonts w:ascii="Courier New" w:hAnsi="Courier New" w:cs="Courier New"/>
+          <w:b/>
+          <w:bCs/>
+        </w:rPr>
+        <w:t>27</w:t>
+      </w:r>
+      <w:r>
+        <w:rPr>
+          <w:rFonts w:ascii="Courier New" w:hAnsi="Courier New" w:cs="Courier New"/>
+          <w:b/>
+          <w:bCs/>
+        </w:rPr>
+        <w:t>/02/20</w:t>
+      </w:r>
+      <w:r>
+        <w:rPr>
+          <w:rFonts w:ascii="Courier New" w:hAnsi="Courier New" w:cs="Courier New"/>
+          <w:b/>
+          <w:bCs/>
+        </w:rPr>
+        <w:t>2</w:t>
+      </w:r>
+      <w:r>
+        <w:rPr>
+          <w:rFonts w:ascii="Courier New" w:hAnsi="Courier New" w:cs="Courier New"/>
+          <w:b/>
+          <w:bCs/>
+        </w:rPr>
+        <w:t xml:space="preserve">6 </w:t>
+      </w:r>
+    </w:p>
+    <w:p>
+      <w:pPr>
+        <w:pStyle w:val="PlainText"/>
+        <w:rPr>
+          <w:rFonts w:ascii="Courier New" w:hAnsi="Courier New" w:cs="Courier New"/>
+        </w:rPr>
+      </w:pPr>
+      <w:r>
+        <w:rPr>
+          <w:rFonts w:ascii="Courier New" w:hAnsi="Courier New" w:cs="Courier New"/>
+        </w:rPr>
+        <w:t>========================================</w:t>
+      </w:r>
+    </w:p>
+    <w:p>
+      <w:pPr>
+        <w:pStyle w:val="PlainText"/>
+        <w:rPr>
+          <w:rFonts w:ascii="Courier New" w:hAnsi="Courier New" w:cs="Courier New"/>
+        </w:rPr>
+      </w:pPr>
+    </w:p>
+    <w:p>
+      <w:pPr>
+        <w:pStyle w:val="PlainText"/>
+        <w:numPr>
+          <w:ilvl w:val="0"/>
+          <w:numId w:val="12"/>
+        </w:numPr>
+        <w:rPr>
+          <w:rFonts w:ascii="Courier New" w:hAnsi="Courier New" w:cs="Courier New"/>
+        </w:rPr>
+      </w:pPr>
+      <w:r>
+        <w:rPr>
+          <w:rFonts w:ascii="Courier New" w:hAnsi="Courier New" w:cs="Courier New"/>
+        </w:rPr>
+        <w:t>Added default pre-selections when the tool initially opens, to give people a sense of differences across products. This means they’re not facing a completely blank slate.</w:t>
+      </w:r>
+    </w:p>
+    <w:p>
+      <w:pPr>
+        <w:pStyle w:val="PlainText"/>
+        <w:numPr>
+          <w:ilvl w:val="0"/>
+          <w:numId w:val="12"/>
+        </w:numPr>
+        <w:rPr>
+          <w:rFonts w:ascii="Courier New" w:hAnsi="Courier New" w:cs="Courier New"/>
+        </w:rPr>
+      </w:pPr>
+      <w:r>
+        <w:rPr>
+          <w:rFonts w:ascii="Courier New" w:hAnsi="Courier New" w:cs="Courier New"/>
+        </w:rPr>
+        <w:t>Improved the visual design of the main chart to make it clearer and less cluttered.</w:t>
+      </w:r>
+    </w:p>
+    <w:p>
+      <w:pPr>
+        <w:pStyle w:val="PlainText"/>
+        <w:rPr>
+          <w:rFonts w:ascii="Courier New" w:hAnsi="Courier New" w:cs="Courier New"/>
+        </w:rPr>
+      </w:pPr>
+    </w:p>
+    <w:p>
+      <w:pPr>
+        <w:pStyle w:val="PlainText"/>
+        <w:rPr>
+          <w:rFonts w:ascii="Courier New" w:hAnsi="Courier New" w:cs="Courier New"/>
+        </w:rPr>
+      </w:pPr>
+    </w:p>
+    <w:p>
+      <w:pPr>
+        <w:pStyle w:val="PlainText"/>
+        <w:rPr>
+          <w:rFonts w:ascii="Courier New" w:hAnsi="Courier New" w:cs="Courier New"/>
+        </w:rPr>
+      </w:pPr>
+      <w:r>
+        <w:rPr>
+          <w:rFonts w:ascii="Courier New" w:hAnsi="Courier New" w:cs="Courier New"/>
+        </w:rPr>
+        <w:t>========================================</w:t>
+      </w:r>
+    </w:p>
+    <w:p>
+      <w:pPr>
+        <w:pStyle w:val="PlainText"/>
+        <w:rPr>
+          <w:rFonts w:ascii="Courier New" w:hAnsi="Courier New" w:cs="Courier New"/>
+          <w:b/>
+          <w:bCs/>
+        </w:rPr>
+      </w:pPr>
+      <w:r>
+        <w:rPr>
+          <w:rFonts w:ascii="Courier New" w:hAnsi="Courier New" w:cs="Courier New"/>
+          <w:b/>
+          <w:bCs/>
+        </w:rPr>
+        <w:t>24</w:t>
+      </w:r>
+      <w:r>
+        <w:rPr>
+          <w:rFonts w:ascii="Courier New" w:hAnsi="Courier New" w:cs="Courier New"/>
+          <w:b/>
+          <w:bCs/>
+        </w:rPr>
+        <w:t>/02/20</w:t>
+      </w:r>
+      <w:r>
+        <w:rPr>
+          <w:rFonts w:ascii="Courier New" w:hAnsi="Courier New" w:cs="Courier New"/>
+          <w:b/>
+          <w:bCs/>
+        </w:rPr>
+        <w:t>2</w:t>
+      </w:r>
+      <w:r>
+        <w:rPr>
+          <w:rFonts w:ascii="Courier New" w:hAnsi="Courier New" w:cs="Courier New"/>
+          <w:b/>
+          <w:bCs/>
+        </w:rPr>
+        <w:t xml:space="preserve">6 </w:t>
+      </w:r>
+    </w:p>
+    <w:p>
+      <w:pPr>
+        <w:pStyle w:val="PlainText"/>
+        <w:rPr>
+          <w:rFonts w:ascii="Courier New" w:hAnsi="Courier New" w:cs="Courier New"/>
+        </w:rPr>
+      </w:pPr>
+      <w:r>
+        <w:rPr>
+          <w:rFonts w:ascii="Courier New" w:hAnsi="Courier New" w:cs="Courier New"/>
+        </w:rPr>
+        <w:t>========================================</w:t>
+      </w:r>
+    </w:p>
+    <w:p>
+      <w:pPr>
+        <w:pStyle w:val="PlainText"/>
+        <w:rPr>
+          <w:rFonts w:ascii="Courier New" w:hAnsi="Courier New" w:cs="Courier New"/>
+        </w:rPr>
+      </w:pPr>
+    </w:p>
+    <w:p>
+      <w:pPr>
+        <w:pStyle w:val="PlainText"/>
+        <w:numPr>
+          <w:ilvl w:val="0"/>
+          <w:numId w:val="12"/>
+        </w:numPr>
+        <w:rPr>
+          <w:rFonts w:ascii="Courier New" w:hAnsi="Courier New" w:cs="Courier New"/>
+        </w:rPr>
+      </w:pPr>
+      <w:r>
+        <w:rPr>
+          <w:rFonts w:ascii="Courier New" w:hAnsi="Courier New" w:cs="Courier New"/>
+        </w:rPr>
+        <w:t>For users with slower connections, the product list would load slowly and if they searched for products earlier, no options would appear. This has been fixed.</w:t>
+      </w:r>
     </w:p>
     <w:p>
       <w:pPr>
@@ -367,6 +941,7 @@
         <w:rPr>
           <w:rFonts w:ascii="Courier New" w:hAnsi="Courier New" w:cs="Courier New"/>
         </w:rPr>
+        <w:lastRenderedPageBreak/>
         <w:t>========================================</w:t>
       </w:r>
     </w:p>
@@ -705,7 +1280,6 @@
         <w:rPr>
           <w:rFonts w:ascii="Courier New" w:hAnsi="Courier New" w:cs="Courier New"/>
         </w:rPr>
-        <w:lastRenderedPageBreak/>
         <w:t>========================================</w:t>
       </w:r>
     </w:p>
@@ -993,6 +1567,119 @@
 <file path=word/numbering.xml><?xml version="1.0" encoding="utf-8"?>
 <w:numbering xmlns:wpc="http://schemas.microsoft.com/office/word/2010/wordprocessingCanvas" xmlns:cx="http://schemas.microsoft.com/office/drawing/2014/chartex" xmlns:cx1="http://schemas.microsoft.com/office/drawing/2015/9/8/chartex" xmlns:cx2="http://schemas.microsoft.com/office/drawing/2015/10/21/chartex" xmlns:cx3="http://schemas.microsoft.com/office/drawing/2016/5/9/chartex" xmlns:cx4="http://schemas.microsoft.com/office/drawing/2016/5/10/chartex" xmlns:cx5="http://schemas.microsoft.com/office/drawing/2016/5/11/chartex" xmlns:cx6="http://schemas.microsoft.com/office/drawing/2016/5/12/chartex" xmlns:cx7="http://schemas.microsoft.com/office/drawing/2016/5/13/chartex" xmlns:cx8="http://schemas.microsoft.com/office/drawing/2016/5/14/chartex" xmlns:mc="http://schemas.openxmlformats.org/markup-compatibility/2006" xmlns:aink="http://schemas.microsoft.com/office/drawing/2016/ink" xmlns:am3d="http://schemas.microsoft.com/office/drawing/2017/model3d" xmlns:o="urn:schemas-microsoft-com:office:office" xmlns:oel="http://schemas.microsoft.com/office/2019/extlst" xmlns:r="http://schemas.openxmlformats.org/officeDocument/2006/relationships" xmlns:m="http://schemas.openxmlformats.org/officeDocument/2006/math" xmlns:v="urn:schemas-microsoft-com:vml" xmlns:wp14="http://schemas.microsoft.com/office/word/2010/wordprocessingDrawing" xmlns:wp="http://schemas.openxmlformats.org/drawingml/2006/wordprocessingDrawing" xmlns:w10="urn:schemas-microsoft-com:office:word" xmlns:w="http://schemas.openxmlformats.org/wordprocessingml/2006/main" xmlns:w14="http://schemas.microsoft.com/office/word/2010/wordml" xmlns:w15="http://schemas.microsoft.com/office/word/2012/wordml" xmlns:w16cex="http://schemas.microsoft.com/office/word/2018/wordml/cex" xmlns:w16cid="http://schemas.microsoft.com/office/word/2016/wordml/cid" xmlns:w16="http://schemas.microsoft.com/office/word/2018/wordml" xmlns:w16du="http://schemas.microsoft.com/office/word/2023/wordml/word16du" xmlns:w16sdtdh="http://schemas.microsoft.com/office/word/2020/wordml/sdtdatahash" xmlns:w16sdtfl="http://schemas.microsoft.com/office/word/2024/wordml/sdtformatlock" xmlns:w16se="http://schemas.microsoft.com/office/word/2015/wordml/symex" xmlns:wpg="http://schemas.microsoft.com/office/word/2010/wordprocessingGroup" xmlns:wpi="http://schemas.microsoft.com/office/word/2010/wordprocessingInk" xmlns:wne="http://schemas.microsoft.com/office/word/2006/wordml" xmlns:wps="http://schemas.microsoft.com/office/word/2010/wordprocessingShape" mc:Ignorable="w14 w15 w16se w16cid w16 w16cex w16sdtdh w16sdtfl w16du wp14">
   <w:abstractNum w:abstractNumId="0" w15:restartNumberingAfterBreak="0">
+    <w:nsid w:val="0E440662"/>
+    <w:multiLevelType w:val="hybridMultilevel"/>
+    <w:tmpl w:val="22545E26"/>
+    <w:lvl w:ilvl="0" w:tplc="08090001">
+      <w:start w:val="1"/>
+      <w:numFmt w:val="bullet"/>
+      <w:lvlText w:val=""/>
+      <w:lvlJc w:val="left"/>
+      <w:pPr>
+        <w:ind w:left="720" w:hanging="360"/>
+      </w:pPr>
+      <w:rPr>
+        <w:rFonts w:ascii="Symbol" w:hAnsi="Symbol" w:hint="default"/>
+      </w:rPr>
+    </w:lvl>
+    <w:lvl w:ilvl="1" w:tplc="FFFFFFFF" w:tentative="1">
+      <w:start w:val="1"/>
+      <w:numFmt w:val="bullet"/>
+      <w:lvlText w:val="o"/>
+      <w:lvlJc w:val="left"/>
+      <w:pPr>
+        <w:ind w:left="1440" w:hanging="360"/>
+      </w:pPr>
+      <w:rPr>
+        <w:rFonts w:ascii="Courier New" w:hAnsi="Courier New" w:cs="Courier New" w:hint="default"/>
+      </w:rPr>
+    </w:lvl>
+    <w:lvl w:ilvl="2" w:tplc="FFFFFFFF" w:tentative="1">
+      <w:start w:val="1"/>
+      <w:numFmt w:val="bullet"/>
+      <w:lvlText w:val=""/>
+      <w:lvlJc w:val="left"/>
+      <w:pPr>
+        <w:ind w:left="2160" w:hanging="360"/>
+      </w:pPr>
+      <w:rPr>
+        <w:rFonts w:ascii="Wingdings" w:hAnsi="Wingdings" w:hint="default"/>
+      </w:rPr>
+    </w:lvl>
+    <w:lvl w:ilvl="3" w:tplc="FFFFFFFF" w:tentative="1">
+      <w:start w:val="1"/>
+      <w:numFmt w:val="bullet"/>
+      <w:lvlText w:val=""/>
+      <w:lvlJc w:val="left"/>
+      <w:pPr>
+        <w:ind w:left="2880" w:hanging="360"/>
+      </w:pPr>
+      <w:rPr>
+        <w:rFonts w:ascii="Symbol" w:hAnsi="Symbol" w:hint="default"/>
+      </w:rPr>
+    </w:lvl>
+    <w:lvl w:ilvl="4" w:tplc="FFFFFFFF" w:tentative="1">
+      <w:start w:val="1"/>
+      <w:numFmt w:val="bullet"/>
+      <w:lvlText w:val="o"/>
+      <w:lvlJc w:val="left"/>
+      <w:pPr>
+        <w:ind w:left="3600" w:hanging="360"/>
+      </w:pPr>
+      <w:rPr>
+        <w:rFonts w:ascii="Courier New" w:hAnsi="Courier New" w:cs="Courier New" w:hint="default"/>
+      </w:rPr>
+    </w:lvl>
+    <w:lvl w:ilvl="5" w:tplc="FFFFFFFF" w:tentative="1">
+      <w:start w:val="1"/>
+      <w:numFmt w:val="bullet"/>
+      <w:lvlText w:val=""/>
+      <w:lvlJc w:val="left"/>
+      <w:pPr>
+        <w:ind w:left="4320" w:hanging="360"/>
+      </w:pPr>
+      <w:rPr>
+        <w:rFonts w:ascii="Wingdings" w:hAnsi="Wingdings" w:hint="default"/>
+      </w:rPr>
+    </w:lvl>
+    <w:lvl w:ilvl="6" w:tplc="FFFFFFFF" w:tentative="1">
+      <w:start w:val="1"/>
+      <w:numFmt w:val="bullet"/>
+      <w:lvlText w:val=""/>
+      <w:lvlJc w:val="left"/>
+      <w:pPr>
+        <w:ind w:left="5040" w:hanging="360"/>
+      </w:pPr>
+      <w:rPr>
+        <w:rFonts w:ascii="Symbol" w:hAnsi="Symbol" w:hint="default"/>
+      </w:rPr>
+    </w:lvl>
+    <w:lvl w:ilvl="7" w:tplc="FFFFFFFF" w:tentative="1">
+      <w:start w:val="1"/>
+      <w:numFmt w:val="bullet"/>
+      <w:lvlText w:val="o"/>
+      <w:lvlJc w:val="left"/>
+      <w:pPr>
+        <w:ind w:left="5760" w:hanging="360"/>
+      </w:pPr>
+      <w:rPr>
+        <w:rFonts w:ascii="Courier New" w:hAnsi="Courier New" w:cs="Courier New" w:hint="default"/>
+      </w:rPr>
+    </w:lvl>
+    <w:lvl w:ilvl="8" w:tplc="FFFFFFFF" w:tentative="1">
+      <w:start w:val="1"/>
+      <w:numFmt w:val="bullet"/>
+      <w:lvlText w:val=""/>
+      <w:lvlJc w:val="left"/>
+      <w:pPr>
+        <w:ind w:left="6480" w:hanging="360"/>
+      </w:pPr>
+      <w:rPr>
+        <w:rFonts w:ascii="Wingdings" w:hAnsi="Wingdings" w:hint="default"/>
+      </w:rPr>
+    </w:lvl>
+  </w:abstractNum>
+  <w:abstractNum w:abstractNumId="1" w15:restartNumberingAfterBreak="0">
     <w:nsid w:val="1CDE3408"/>
     <w:multiLevelType w:val="hybridMultilevel"/>
     <w:tmpl w:val="957A030E"/>
@@ -1104,7 +1791,231 @@
       </w:rPr>
     </w:lvl>
   </w:abstractNum>
-  <w:abstractNum w:abstractNumId="1" w15:restartNumberingAfterBreak="0">
+  <w:abstractNum w:abstractNumId="2" w15:restartNumberingAfterBreak="0">
+    <w:nsid w:val="1E34564B"/>
+    <w:multiLevelType w:val="hybridMultilevel"/>
+    <w:tmpl w:val="88C08ED0"/>
+    <w:lvl w:ilvl="0" w:tplc="5CDAAF96">
+      <w:numFmt w:val="bullet"/>
+      <w:lvlText w:val="-"/>
+      <w:lvlJc w:val="left"/>
+      <w:pPr>
+        <w:ind w:left="720" w:hanging="360"/>
+      </w:pPr>
+      <w:rPr>
+        <w:rFonts w:ascii="Courier New" w:eastAsiaTheme="minorHAnsi" w:hAnsi="Courier New" w:cs="Courier New" w:hint="default"/>
+      </w:rPr>
+    </w:lvl>
+    <w:lvl w:ilvl="1" w:tplc="08090003" w:tentative="1">
+      <w:start w:val="1"/>
+      <w:numFmt w:val="bullet"/>
+      <w:lvlText w:val="o"/>
+      <w:lvlJc w:val="left"/>
+      <w:pPr>
+        <w:ind w:left="1440" w:hanging="360"/>
+      </w:pPr>
+      <w:rPr>
+        <w:rFonts w:ascii="Courier New" w:hAnsi="Courier New" w:cs="Courier New" w:hint="default"/>
+      </w:rPr>
+    </w:lvl>
+    <w:lvl w:ilvl="2" w:tplc="08090005" w:tentative="1">
+      <w:start w:val="1"/>
+      <w:numFmt w:val="bullet"/>
+      <w:lvlText w:val=""/>
+      <w:lvlJc w:val="left"/>
+      <w:pPr>
+        <w:ind w:left="2160" w:hanging="360"/>
+      </w:pPr>
+      <w:rPr>
+        <w:rFonts w:ascii="Wingdings" w:hAnsi="Wingdings" w:hint="default"/>
+      </w:rPr>
+    </w:lvl>
+    <w:lvl w:ilvl="3" w:tplc="08090001" w:tentative="1">
+      <w:start w:val="1"/>
+      <w:numFmt w:val="bullet"/>
+      <w:lvlText w:val=""/>
+      <w:lvlJc w:val="left"/>
+      <w:pPr>
+        <w:ind w:left="2880" w:hanging="360"/>
+      </w:pPr>
+      <w:rPr>
+        <w:rFonts w:ascii="Symbol" w:hAnsi="Symbol" w:hint="default"/>
+      </w:rPr>
+    </w:lvl>
+    <w:lvl w:ilvl="4" w:tplc="08090003" w:tentative="1">
+      <w:start w:val="1"/>
+      <w:numFmt w:val="bullet"/>
+      <w:lvlText w:val="o"/>
+      <w:lvlJc w:val="left"/>
+      <w:pPr>
+        <w:ind w:left="3600" w:hanging="360"/>
+      </w:pPr>
+      <w:rPr>
+        <w:rFonts w:ascii="Courier New" w:hAnsi="Courier New" w:cs="Courier New" w:hint="default"/>
+      </w:rPr>
+    </w:lvl>
+    <w:lvl w:ilvl="5" w:tplc="08090005" w:tentative="1">
+      <w:start w:val="1"/>
+      <w:numFmt w:val="bullet"/>
+      <w:lvlText w:val=""/>
+      <w:lvlJc w:val="left"/>
+      <w:pPr>
+        <w:ind w:left="4320" w:hanging="360"/>
+      </w:pPr>
+      <w:rPr>
+        <w:rFonts w:ascii="Wingdings" w:hAnsi="Wingdings" w:hint="default"/>
+      </w:rPr>
+    </w:lvl>
+    <w:lvl w:ilvl="6" w:tplc="08090001" w:tentative="1">
+      <w:start w:val="1"/>
+      <w:numFmt w:val="bullet"/>
+      <w:lvlText w:val=""/>
+      <w:lvlJc w:val="left"/>
+      <w:pPr>
+        <w:ind w:left="5040" w:hanging="360"/>
+      </w:pPr>
+      <w:rPr>
+        <w:rFonts w:ascii="Symbol" w:hAnsi="Symbol" w:hint="default"/>
+      </w:rPr>
+    </w:lvl>
+    <w:lvl w:ilvl="7" w:tplc="08090003" w:tentative="1">
+      <w:start w:val="1"/>
+      <w:numFmt w:val="bullet"/>
+      <w:lvlText w:val="o"/>
+      <w:lvlJc w:val="left"/>
+      <w:pPr>
+        <w:ind w:left="5760" w:hanging="360"/>
+      </w:pPr>
+      <w:rPr>
+        <w:rFonts w:ascii="Courier New" w:hAnsi="Courier New" w:cs="Courier New" w:hint="default"/>
+      </w:rPr>
+    </w:lvl>
+    <w:lvl w:ilvl="8" w:tplc="08090005" w:tentative="1">
+      <w:start w:val="1"/>
+      <w:numFmt w:val="bullet"/>
+      <w:lvlText w:val=""/>
+      <w:lvlJc w:val="left"/>
+      <w:pPr>
+        <w:ind w:left="6480" w:hanging="360"/>
+      </w:pPr>
+      <w:rPr>
+        <w:rFonts w:ascii="Wingdings" w:hAnsi="Wingdings" w:hint="default"/>
+      </w:rPr>
+    </w:lvl>
+  </w:abstractNum>
+  <w:abstractNum w:abstractNumId="3" w15:restartNumberingAfterBreak="0">
+    <w:nsid w:val="1F356ABD"/>
+    <w:multiLevelType w:val="hybridMultilevel"/>
+    <w:tmpl w:val="38661FBE"/>
+    <w:lvl w:ilvl="0" w:tplc="1422A02E">
+      <w:numFmt w:val="bullet"/>
+      <w:lvlText w:val="-"/>
+      <w:lvlJc w:val="left"/>
+      <w:pPr>
+        <w:ind w:left="1440" w:hanging="360"/>
+      </w:pPr>
+      <w:rPr>
+        <w:rFonts w:ascii="Courier New" w:eastAsiaTheme="minorHAnsi" w:hAnsi="Courier New" w:cs="Courier New" w:hint="default"/>
+      </w:rPr>
+    </w:lvl>
+    <w:lvl w:ilvl="1" w:tplc="08090003" w:tentative="1">
+      <w:start w:val="1"/>
+      <w:numFmt w:val="bullet"/>
+      <w:lvlText w:val="o"/>
+      <w:lvlJc w:val="left"/>
+      <w:pPr>
+        <w:ind w:left="2160" w:hanging="360"/>
+      </w:pPr>
+      <w:rPr>
+        <w:rFonts w:ascii="Courier New" w:hAnsi="Courier New" w:cs="Courier New" w:hint="default"/>
+      </w:rPr>
+    </w:lvl>
+    <w:lvl w:ilvl="2" w:tplc="08090005" w:tentative="1">
+      <w:start w:val="1"/>
+      <w:numFmt w:val="bullet"/>
+      <w:lvlText w:val=""/>
+      <w:lvlJc w:val="left"/>
+      <w:pPr>
+        <w:ind w:left="2880" w:hanging="360"/>
+      </w:pPr>
+      <w:rPr>
+        <w:rFonts w:ascii="Wingdings" w:hAnsi="Wingdings" w:hint="default"/>
+      </w:rPr>
+    </w:lvl>
+    <w:lvl w:ilvl="3" w:tplc="08090001" w:tentative="1">
+      <w:start w:val="1"/>
+      <w:numFmt w:val="bullet"/>
+      <w:lvlText w:val=""/>
+      <w:lvlJc w:val="left"/>
+      <w:pPr>
+        <w:ind w:left="3600" w:hanging="360"/>
+      </w:pPr>
+      <w:rPr>
+        <w:rFonts w:ascii="Symbol" w:hAnsi="Symbol" w:hint="default"/>
+      </w:rPr>
+    </w:lvl>
+    <w:lvl w:ilvl="4" w:tplc="08090003" w:tentative="1">
+      <w:start w:val="1"/>
+      <w:numFmt w:val="bullet"/>
+      <w:lvlText w:val="o"/>
+      <w:lvlJc w:val="left"/>
+      <w:pPr>
+        <w:ind w:left="4320" w:hanging="360"/>
+      </w:pPr>
+      <w:rPr>
+        <w:rFonts w:ascii="Courier New" w:hAnsi="Courier New" w:cs="Courier New" w:hint="default"/>
+      </w:rPr>
+    </w:lvl>
+    <w:lvl w:ilvl="5" w:tplc="08090005" w:tentative="1">
+      <w:start w:val="1"/>
+      <w:numFmt w:val="bullet"/>
+      <w:lvlText w:val=""/>
+      <w:lvlJc w:val="left"/>
+      <w:pPr>
+        <w:ind w:left="5040" w:hanging="360"/>
+      </w:pPr>
+      <w:rPr>
+        <w:rFonts w:ascii="Wingdings" w:hAnsi="Wingdings" w:hint="default"/>
+      </w:rPr>
+    </w:lvl>
+    <w:lvl w:ilvl="6" w:tplc="08090001" w:tentative="1">
+      <w:start w:val="1"/>
+      <w:numFmt w:val="bullet"/>
+      <w:lvlText w:val=""/>
+      <w:lvlJc w:val="left"/>
+      <w:pPr>
+        <w:ind w:left="5760" w:hanging="360"/>
+      </w:pPr>
+      <w:rPr>
+        <w:rFonts w:ascii="Symbol" w:hAnsi="Symbol" w:hint="default"/>
+      </w:rPr>
+    </w:lvl>
+    <w:lvl w:ilvl="7" w:tplc="08090003" w:tentative="1">
+      <w:start w:val="1"/>
+      <w:numFmt w:val="bullet"/>
+      <w:lvlText w:val="o"/>
+      <w:lvlJc w:val="left"/>
+      <w:pPr>
+        <w:ind w:left="6480" w:hanging="360"/>
+      </w:pPr>
+      <w:rPr>
+        <w:rFonts w:ascii="Courier New" w:hAnsi="Courier New" w:cs="Courier New" w:hint="default"/>
+      </w:rPr>
+    </w:lvl>
+    <w:lvl w:ilvl="8" w:tplc="08090005" w:tentative="1">
+      <w:start w:val="1"/>
+      <w:numFmt w:val="bullet"/>
+      <w:lvlText w:val=""/>
+      <w:lvlJc w:val="left"/>
+      <w:pPr>
+        <w:ind w:left="7200" w:hanging="360"/>
+      </w:pPr>
+      <w:rPr>
+        <w:rFonts w:ascii="Wingdings" w:hAnsi="Wingdings" w:hint="default"/>
+      </w:rPr>
+    </w:lvl>
+  </w:abstractNum>
+  <w:abstractNum w:abstractNumId="4" w15:restartNumberingAfterBreak="0">
     <w:nsid w:val="22735F87"/>
     <w:multiLevelType w:val="hybridMultilevel"/>
     <w:tmpl w:val="1558551A"/>
@@ -1217,7 +2128,119 @@
       </w:rPr>
     </w:lvl>
   </w:abstractNum>
-  <w:abstractNum w:abstractNumId="2" w15:restartNumberingAfterBreak="0">
+  <w:abstractNum w:abstractNumId="5" w15:restartNumberingAfterBreak="0">
+    <w:nsid w:val="26C768F7"/>
+    <w:multiLevelType w:val="hybridMultilevel"/>
+    <w:tmpl w:val="86BC632C"/>
+    <w:lvl w:ilvl="0" w:tplc="47342C5E">
+      <w:numFmt w:val="bullet"/>
+      <w:lvlText w:val="-"/>
+      <w:lvlJc w:val="left"/>
+      <w:pPr>
+        <w:ind w:left="720" w:hanging="360"/>
+      </w:pPr>
+      <w:rPr>
+        <w:rFonts w:ascii="Courier New" w:eastAsiaTheme="minorHAnsi" w:hAnsi="Courier New" w:cs="Courier New" w:hint="default"/>
+      </w:rPr>
+    </w:lvl>
+    <w:lvl w:ilvl="1" w:tplc="08090003" w:tentative="1">
+      <w:start w:val="1"/>
+      <w:numFmt w:val="bullet"/>
+      <w:lvlText w:val="o"/>
+      <w:lvlJc w:val="left"/>
+      <w:pPr>
+        <w:ind w:left="1440" w:hanging="360"/>
+      </w:pPr>
+      <w:rPr>
+        <w:rFonts w:ascii="Courier New" w:hAnsi="Courier New" w:cs="Courier New" w:hint="default"/>
+      </w:rPr>
+    </w:lvl>
+    <w:lvl w:ilvl="2" w:tplc="08090005" w:tentative="1">
+      <w:start w:val="1"/>
+      <w:numFmt w:val="bullet"/>
+      <w:lvlText w:val=""/>
+      <w:lvlJc w:val="left"/>
+      <w:pPr>
+        <w:ind w:left="2160" w:hanging="360"/>
+      </w:pPr>
+      <w:rPr>
+        <w:rFonts w:ascii="Wingdings" w:hAnsi="Wingdings" w:hint="default"/>
+      </w:rPr>
+    </w:lvl>
+    <w:lvl w:ilvl="3" w:tplc="08090001" w:tentative="1">
+      <w:start w:val="1"/>
+      <w:numFmt w:val="bullet"/>
+      <w:lvlText w:val=""/>
+      <w:lvlJc w:val="left"/>
+      <w:pPr>
+        <w:ind w:left="2880" w:hanging="360"/>
+      </w:pPr>
+      <w:rPr>
+        <w:rFonts w:ascii="Symbol" w:hAnsi="Symbol" w:hint="default"/>
+      </w:rPr>
+    </w:lvl>
+    <w:lvl w:ilvl="4" w:tplc="08090003" w:tentative="1">
+      <w:start w:val="1"/>
+      <w:numFmt w:val="bullet"/>
+      <w:lvlText w:val="o"/>
+      <w:lvlJc w:val="left"/>
+      <w:pPr>
+        <w:ind w:left="3600" w:hanging="360"/>
+      </w:pPr>
+      <w:rPr>
+        <w:rFonts w:ascii="Courier New" w:hAnsi="Courier New" w:cs="Courier New" w:hint="default"/>
+      </w:rPr>
+    </w:lvl>
+    <w:lvl w:ilvl="5" w:tplc="08090005" w:tentative="1">
+      <w:start w:val="1"/>
+      <w:numFmt w:val="bullet"/>
+      <w:lvlText w:val=""/>
+      <w:lvlJc w:val="left"/>
+      <w:pPr>
+        <w:ind w:left="4320" w:hanging="360"/>
+      </w:pPr>
+      <w:rPr>
+        <w:rFonts w:ascii="Wingdings" w:hAnsi="Wingdings" w:hint="default"/>
+      </w:rPr>
+    </w:lvl>
+    <w:lvl w:ilvl="6" w:tplc="08090001" w:tentative="1">
+      <w:start w:val="1"/>
+      <w:numFmt w:val="bullet"/>
+      <w:lvlText w:val=""/>
+      <w:lvlJc w:val="left"/>
+      <w:pPr>
+        <w:ind w:left="5040" w:hanging="360"/>
+      </w:pPr>
+      <w:rPr>
+        <w:rFonts w:ascii="Symbol" w:hAnsi="Symbol" w:hint="default"/>
+      </w:rPr>
+    </w:lvl>
+    <w:lvl w:ilvl="7" w:tplc="08090003" w:tentative="1">
+      <w:start w:val="1"/>
+      <w:numFmt w:val="bullet"/>
+      <w:lvlText w:val="o"/>
+      <w:lvlJc w:val="left"/>
+      <w:pPr>
+        <w:ind w:left="5760" w:hanging="360"/>
+      </w:pPr>
+      <w:rPr>
+        <w:rFonts w:ascii="Courier New" w:hAnsi="Courier New" w:cs="Courier New" w:hint="default"/>
+      </w:rPr>
+    </w:lvl>
+    <w:lvl w:ilvl="8" w:tplc="08090005" w:tentative="1">
+      <w:start w:val="1"/>
+      <w:numFmt w:val="bullet"/>
+      <w:lvlText w:val=""/>
+      <w:lvlJc w:val="left"/>
+      <w:pPr>
+        <w:ind w:left="6480" w:hanging="360"/>
+      </w:pPr>
+      <w:rPr>
+        <w:rFonts w:ascii="Wingdings" w:hAnsi="Wingdings" w:hint="default"/>
+      </w:rPr>
+    </w:lvl>
+  </w:abstractNum>
+  <w:abstractNum w:abstractNumId="6" w15:restartNumberingAfterBreak="0">
     <w:nsid w:val="33CC460F"/>
     <w:multiLevelType w:val="hybridMultilevel"/>
     <w:tmpl w:val="362A3094"/>
@@ -1330,7 +2353,7 @@
       </w:rPr>
     </w:lvl>
   </w:abstractNum>
-  <w:abstractNum w:abstractNumId="3" w15:restartNumberingAfterBreak="0">
+  <w:abstractNum w:abstractNumId="7" w15:restartNumberingAfterBreak="0">
     <w:nsid w:val="37795A69"/>
     <w:multiLevelType w:val="hybridMultilevel"/>
     <w:tmpl w:val="43242F98"/>
@@ -1443,7 +2466,7 @@
       </w:rPr>
     </w:lvl>
   </w:abstractNum>
-  <w:abstractNum w:abstractNumId="4" w15:restartNumberingAfterBreak="0">
+  <w:abstractNum w:abstractNumId="8" w15:restartNumberingAfterBreak="0">
     <w:nsid w:val="37C24BC9"/>
     <w:multiLevelType w:val="hybridMultilevel"/>
     <w:tmpl w:val="6004E3E6"/>
@@ -1555,7 +2578,7 @@
       </w:rPr>
     </w:lvl>
   </w:abstractNum>
-  <w:abstractNum w:abstractNumId="5" w15:restartNumberingAfterBreak="0">
+  <w:abstractNum w:abstractNumId="9" w15:restartNumberingAfterBreak="0">
     <w:nsid w:val="4B746A90"/>
     <w:multiLevelType w:val="hybridMultilevel"/>
     <w:tmpl w:val="896ED93E"/>
@@ -1667,7 +2690,7 @@
       </w:rPr>
     </w:lvl>
   </w:abstractNum>
-  <w:abstractNum w:abstractNumId="6" w15:restartNumberingAfterBreak="0">
+  <w:abstractNum w:abstractNumId="10" w15:restartNumberingAfterBreak="0">
     <w:nsid w:val="4E6D7531"/>
     <w:multiLevelType w:val="hybridMultilevel"/>
     <w:tmpl w:val="5D8639A8"/>
@@ -1779,7 +2802,7 @@
       </w:rPr>
     </w:lvl>
   </w:abstractNum>
-  <w:abstractNum w:abstractNumId="7" w15:restartNumberingAfterBreak="0">
+  <w:abstractNum w:abstractNumId="11" w15:restartNumberingAfterBreak="0">
     <w:nsid w:val="4FED7B55"/>
     <w:multiLevelType w:val="hybridMultilevel"/>
     <w:tmpl w:val="153C0C80"/>
@@ -1892,7 +2915,232 @@
       </w:rPr>
     </w:lvl>
   </w:abstractNum>
-  <w:abstractNum w:abstractNumId="8" w15:restartNumberingAfterBreak="0">
+  <w:abstractNum w:abstractNumId="12" w15:restartNumberingAfterBreak="0">
+    <w:nsid w:val="57EA6FC6"/>
+    <w:multiLevelType w:val="hybridMultilevel"/>
+    <w:tmpl w:val="B4CA1C7C"/>
+    <w:lvl w:ilvl="0" w:tplc="1422A02E">
+      <w:numFmt w:val="bullet"/>
+      <w:lvlText w:val="-"/>
+      <w:lvlJc w:val="left"/>
+      <w:pPr>
+        <w:ind w:left="720" w:hanging="360"/>
+      </w:pPr>
+      <w:rPr>
+        <w:rFonts w:ascii="Courier New" w:eastAsiaTheme="minorHAnsi" w:hAnsi="Courier New" w:cs="Courier New" w:hint="default"/>
+      </w:rPr>
+    </w:lvl>
+    <w:lvl w:ilvl="1" w:tplc="08090003" w:tentative="1">
+      <w:start w:val="1"/>
+      <w:numFmt w:val="bullet"/>
+      <w:lvlText w:val="o"/>
+      <w:lvlJc w:val="left"/>
+      <w:pPr>
+        <w:ind w:left="1440" w:hanging="360"/>
+      </w:pPr>
+      <w:rPr>
+        <w:rFonts w:ascii="Courier New" w:hAnsi="Courier New" w:cs="Courier New" w:hint="default"/>
+      </w:rPr>
+    </w:lvl>
+    <w:lvl w:ilvl="2" w:tplc="08090005" w:tentative="1">
+      <w:start w:val="1"/>
+      <w:numFmt w:val="bullet"/>
+      <w:lvlText w:val=""/>
+      <w:lvlJc w:val="left"/>
+      <w:pPr>
+        <w:ind w:left="2160" w:hanging="360"/>
+      </w:pPr>
+      <w:rPr>
+        <w:rFonts w:ascii="Wingdings" w:hAnsi="Wingdings" w:hint="default"/>
+      </w:rPr>
+    </w:lvl>
+    <w:lvl w:ilvl="3" w:tplc="08090001" w:tentative="1">
+      <w:start w:val="1"/>
+      <w:numFmt w:val="bullet"/>
+      <w:lvlText w:val=""/>
+      <w:lvlJc w:val="left"/>
+      <w:pPr>
+        <w:ind w:left="2880" w:hanging="360"/>
+      </w:pPr>
+      <w:rPr>
+        <w:rFonts w:ascii="Symbol" w:hAnsi="Symbol" w:hint="default"/>
+      </w:rPr>
+    </w:lvl>
+    <w:lvl w:ilvl="4" w:tplc="08090003" w:tentative="1">
+      <w:start w:val="1"/>
+      <w:numFmt w:val="bullet"/>
+      <w:lvlText w:val="o"/>
+      <w:lvlJc w:val="left"/>
+      <w:pPr>
+        <w:ind w:left="3600" w:hanging="360"/>
+      </w:pPr>
+      <w:rPr>
+        <w:rFonts w:ascii="Courier New" w:hAnsi="Courier New" w:cs="Courier New" w:hint="default"/>
+      </w:rPr>
+    </w:lvl>
+    <w:lvl w:ilvl="5" w:tplc="08090005" w:tentative="1">
+      <w:start w:val="1"/>
+      <w:numFmt w:val="bullet"/>
+      <w:lvlText w:val=""/>
+      <w:lvlJc w:val="left"/>
+      <w:pPr>
+        <w:ind w:left="4320" w:hanging="360"/>
+      </w:pPr>
+      <w:rPr>
+        <w:rFonts w:ascii="Wingdings" w:hAnsi="Wingdings" w:hint="default"/>
+      </w:rPr>
+    </w:lvl>
+    <w:lvl w:ilvl="6" w:tplc="08090001" w:tentative="1">
+      <w:start w:val="1"/>
+      <w:numFmt w:val="bullet"/>
+      <w:lvlText w:val=""/>
+      <w:lvlJc w:val="left"/>
+      <w:pPr>
+        <w:ind w:left="5040" w:hanging="360"/>
+      </w:pPr>
+      <w:rPr>
+        <w:rFonts w:ascii="Symbol" w:hAnsi="Symbol" w:hint="default"/>
+      </w:rPr>
+    </w:lvl>
+    <w:lvl w:ilvl="7" w:tplc="08090003" w:tentative="1">
+      <w:start w:val="1"/>
+      <w:numFmt w:val="bullet"/>
+      <w:lvlText w:val="o"/>
+      <w:lvlJc w:val="left"/>
+      <w:pPr>
+        <w:ind w:left="5760" w:hanging="360"/>
+      </w:pPr>
+      <w:rPr>
+        <w:rFonts w:ascii="Courier New" w:hAnsi="Courier New" w:cs="Courier New" w:hint="default"/>
+      </w:rPr>
+    </w:lvl>
+    <w:lvl w:ilvl="8" w:tplc="08090005" w:tentative="1">
+      <w:start w:val="1"/>
+      <w:numFmt w:val="bullet"/>
+      <w:lvlText w:val=""/>
+      <w:lvlJc w:val="left"/>
+      <w:pPr>
+        <w:ind w:left="6480" w:hanging="360"/>
+      </w:pPr>
+      <w:rPr>
+        <w:rFonts w:ascii="Wingdings" w:hAnsi="Wingdings" w:hint="default"/>
+      </w:rPr>
+    </w:lvl>
+  </w:abstractNum>
+  <w:abstractNum w:abstractNumId="13" w15:restartNumberingAfterBreak="0">
+    <w:nsid w:val="5D7A614E"/>
+    <w:multiLevelType w:val="hybridMultilevel"/>
+    <w:tmpl w:val="EB501D5A"/>
+    <w:lvl w:ilvl="0" w:tplc="08090001">
+      <w:start w:val="1"/>
+      <w:numFmt w:val="bullet"/>
+      <w:lvlText w:val=""/>
+      <w:lvlJc w:val="left"/>
+      <w:pPr>
+        <w:ind w:left="720" w:hanging="360"/>
+      </w:pPr>
+      <w:rPr>
+        <w:rFonts w:ascii="Symbol" w:hAnsi="Symbol" w:hint="default"/>
+      </w:rPr>
+    </w:lvl>
+    <w:lvl w:ilvl="1" w:tplc="08090003" w:tentative="1">
+      <w:start w:val="1"/>
+      <w:numFmt w:val="bullet"/>
+      <w:lvlText w:val="o"/>
+      <w:lvlJc w:val="left"/>
+      <w:pPr>
+        <w:ind w:left="1440" w:hanging="360"/>
+      </w:pPr>
+      <w:rPr>
+        <w:rFonts w:ascii="Courier New" w:hAnsi="Courier New" w:cs="Courier New" w:hint="default"/>
+      </w:rPr>
+    </w:lvl>
+    <w:lvl w:ilvl="2" w:tplc="08090005" w:tentative="1">
+      <w:start w:val="1"/>
+      <w:numFmt w:val="bullet"/>
+      <w:lvlText w:val=""/>
+      <w:lvlJc w:val="left"/>
+      <w:pPr>
+        <w:ind w:left="2160" w:hanging="360"/>
+      </w:pPr>
+      <w:rPr>
+        <w:rFonts w:ascii="Wingdings" w:hAnsi="Wingdings" w:hint="default"/>
+      </w:rPr>
+    </w:lvl>
+    <w:lvl w:ilvl="3" w:tplc="08090001" w:tentative="1">
+      <w:start w:val="1"/>
+      <w:numFmt w:val="bullet"/>
+      <w:lvlText w:val=""/>
+      <w:lvlJc w:val="left"/>
+      <w:pPr>
+        <w:ind w:left="2880" w:hanging="360"/>
+      </w:pPr>
+      <w:rPr>
+        <w:rFonts w:ascii="Symbol" w:hAnsi="Symbol" w:hint="default"/>
+      </w:rPr>
+    </w:lvl>
+    <w:lvl w:ilvl="4" w:tplc="08090003" w:tentative="1">
+      <w:start w:val="1"/>
+      <w:numFmt w:val="bullet"/>
+      <w:lvlText w:val="o"/>
+      <w:lvlJc w:val="left"/>
+      <w:pPr>
+        <w:ind w:left="3600" w:hanging="360"/>
+      </w:pPr>
+      <w:rPr>
+        <w:rFonts w:ascii="Courier New" w:hAnsi="Courier New" w:cs="Courier New" w:hint="default"/>
+      </w:rPr>
+    </w:lvl>
+    <w:lvl w:ilvl="5" w:tplc="08090005" w:tentative="1">
+      <w:start w:val="1"/>
+      <w:numFmt w:val="bullet"/>
+      <w:lvlText w:val=""/>
+      <w:lvlJc w:val="left"/>
+      <w:pPr>
+        <w:ind w:left="4320" w:hanging="360"/>
+      </w:pPr>
+      <w:rPr>
+        <w:rFonts w:ascii="Wingdings" w:hAnsi="Wingdings" w:hint="default"/>
+      </w:rPr>
+    </w:lvl>
+    <w:lvl w:ilvl="6" w:tplc="08090001" w:tentative="1">
+      <w:start w:val="1"/>
+      <w:numFmt w:val="bullet"/>
+      <w:lvlText w:val=""/>
+      <w:lvlJc w:val="left"/>
+      <w:pPr>
+        <w:ind w:left="5040" w:hanging="360"/>
+      </w:pPr>
+      <w:rPr>
+        <w:rFonts w:ascii="Symbol" w:hAnsi="Symbol" w:hint="default"/>
+      </w:rPr>
+    </w:lvl>
+    <w:lvl w:ilvl="7" w:tplc="08090003" w:tentative="1">
+      <w:start w:val="1"/>
+      <w:numFmt w:val="bullet"/>
+      <w:lvlText w:val="o"/>
+      <w:lvlJc w:val="left"/>
+      <w:pPr>
+        <w:ind w:left="5760" w:hanging="360"/>
+      </w:pPr>
+      <w:rPr>
+        <w:rFonts w:ascii="Courier New" w:hAnsi="Courier New" w:cs="Courier New" w:hint="default"/>
+      </w:rPr>
+    </w:lvl>
+    <w:lvl w:ilvl="8" w:tplc="08090005" w:tentative="1">
+      <w:start w:val="1"/>
+      <w:numFmt w:val="bullet"/>
+      <w:lvlText w:val=""/>
+      <w:lvlJc w:val="left"/>
+      <w:pPr>
+        <w:ind w:left="6480" w:hanging="360"/>
+      </w:pPr>
+      <w:rPr>
+        <w:rFonts w:ascii="Wingdings" w:hAnsi="Wingdings" w:hint="default"/>
+      </w:rPr>
+    </w:lvl>
+  </w:abstractNum>
+  <w:abstractNum w:abstractNumId="14" w15:restartNumberingAfterBreak="0">
     <w:nsid w:val="7CD24CF2"/>
     <w:multiLevelType w:val="hybridMultilevel"/>
     <w:tmpl w:val="1DD849AA"/>
@@ -2005,31 +3253,49 @@
     </w:lvl>
   </w:abstractNum>
   <w:num w:numId="1" w16cid:durableId="857698144">
+    <w:abstractNumId w:val="14"/>
+  </w:num>
+  <w:num w:numId="2" w16cid:durableId="1872179597">
     <w:abstractNumId w:val="8"/>
   </w:num>
-  <w:num w:numId="2" w16cid:durableId="1872179597">
+  <w:num w:numId="3" w16cid:durableId="1201673090">
+    <w:abstractNumId w:val="7"/>
+  </w:num>
+  <w:num w:numId="4" w16cid:durableId="447746796">
+    <w:abstractNumId w:val="10"/>
+  </w:num>
+  <w:num w:numId="5" w16cid:durableId="1313024706">
+    <w:abstractNumId w:val="11"/>
+  </w:num>
+  <w:num w:numId="6" w16cid:durableId="1438021343">
+    <w:abstractNumId w:val="1"/>
+  </w:num>
+  <w:num w:numId="7" w16cid:durableId="106510689">
     <w:abstractNumId w:val="4"/>
   </w:num>
-  <w:num w:numId="3" w16cid:durableId="1201673090">
+  <w:num w:numId="8" w16cid:durableId="863176197">
+    <w:abstractNumId w:val="9"/>
+  </w:num>
+  <w:num w:numId="9" w16cid:durableId="1785729992">
+    <w:abstractNumId w:val="6"/>
+  </w:num>
+  <w:num w:numId="10" w16cid:durableId="1341197009">
+    <w:abstractNumId w:val="5"/>
+  </w:num>
+  <w:num w:numId="11" w16cid:durableId="1367559494">
+    <w:abstractNumId w:val="2"/>
+  </w:num>
+  <w:num w:numId="12" w16cid:durableId="549265893">
+    <w:abstractNumId w:val="0"/>
+  </w:num>
+  <w:num w:numId="13" w16cid:durableId="940575961">
+    <w:abstractNumId w:val="12"/>
+  </w:num>
+  <w:num w:numId="14" w16cid:durableId="1271664090">
     <w:abstractNumId w:val="3"/>
   </w:num>
-  <w:num w:numId="4" w16cid:durableId="447746796">
-    <w:abstractNumId w:val="6"/>
-  </w:num>
-  <w:num w:numId="5" w16cid:durableId="1313024706">
-    <w:abstractNumId w:val="7"/>
-  </w:num>
-  <w:num w:numId="6" w16cid:durableId="1438021343">
-    <w:abstractNumId w:val="0"/>
-  </w:num>
-  <w:num w:numId="7" w16cid:durableId="106510689">
-    <w:abstractNumId w:val="1"/>
-  </w:num>
-  <w:num w:numId="8" w16cid:durableId="863176197">
-    <w:abstractNumId w:val="5"/>
-  </w:num>
-  <w:num w:numId="9" w16cid:durableId="1785729992">
-    <w:abstractNumId w:val="2"/>
+  <w:num w:numId="15" w16cid:durableId="1883783204">
+    <w:abstractNumId w:val="13"/>
   </w:num>
 </w:numbering>
 </file>

</xml_diff>